<commit_message>
Meridiano: accenti nelle intestazioni di due serie
Due intestazioni portavano le parole in ASCII — «universita» e «cio che e
pubblico» — perché scritte così nel dizionario dei titoli dell'assemblatore.
È la stessa classe di difetto corretta nella Serie terza dell'opera Kissinger,
questa volta introdotta dall'estensore e non da un agente.

Corrette in «università» e «ciò che è pubblico»; rilegature rifatte. Un
controllo automatico sulle parole spia senza accento nei dizionari dei titoli
non trova altri casi, e la riga di chiusura risulta accentata correttamente.

Co-Authored-By: Claude <noreply@anthropic.com>
Claude-Session: https://claude.ai/code/session_01AhkuH2awwGPfHYRbptsHPY
</commit_message>
<xml_diff>
--- a/IL_MERIDIANO_E_LA_VALLE_DAL_SUD_AFRICA_ALLA_PAYPAL_MAFIA.docx
+++ b/IL_MERIDIANO_E_LA_VALLE_DAL_SUD_AFRICA_ALLA_PAYPAL_MAFIA.docx
@@ -15025,7 +15025,7 @@
           <w:sz w:val="24"/>
           <w:szCs w:val="24"/>
         </w:rPr>
-        <w:t xml:space="preserve">Serie ottava — La formazione: scuole, universita, coscrizione</w:t>
+        <w:t xml:space="preserve">Serie ottava — La formazione: scuole, università, coscrizione</w:t>
       </w:r>
     </w:p>
     <w:p>
@@ -20899,7 +20899,7 @@
           <w:sz w:val="24"/>
           <w:szCs w:val="24"/>
         </w:rPr>
-        <w:t xml:space="preserve">Serie undicesima — Il denaro: veicoli, giurisdizioni, e cio che e pubblico</w:t>
+        <w:t xml:space="preserve">Serie undicesima — Il denaro: veicoli, giurisdizioni, e ciò che è pubblico</w:t>
       </w:r>
     </w:p>
     <w:p>

</xml_diff>